<commit_message>
Excel-AI 1.1.0 documents: bug book, tracker, codes map, Word documentation and methods, BUGS/ISSUES (1.0.4 versions to register/releases); paste check PASS
Co-Authored-By: Claude Opus 5.5 <noreply@anthropic.com>
Claude-Session: https://claude.ai/code/session_01VSHkeGXfdtzxSoF8u1xMUR
</commit_message>
<xml_diff>
--- a/excel_ai/mitigation/docs/CPAT-AI-Mitigation_Documentation.docx
+++ b/excel_ai/mitigation/docs/CPAT-AI-Mitigation_Documentation.docx
@@ -25,7 +25,7 @@
         <w:t xml:space="preserve"> </w:t>
       </w:r>
       <w:r>
-        <w:t xml:space="preserve">v1.0.4</w:t>
+        <w:t xml:space="preserve">v1.1.0</w:t>
       </w:r>
     </w:p>
     <w:p>
@@ -41,7 +41,7 @@
         <w:pStyle w:val="Date"/>
       </w:pPr>
       <w:r>
-        <w:t xml:space="preserve">2026-10-29</w:t>
+        <w:t xml:space="preserve">2026-10-30</w:t>
       </w:r>
     </w:p>
     <w:sdt>
@@ -314,7 +314,7 @@
         <w:rPr>
           <w:rStyle w:val="VerbatimChar"/>
         </w:rPr>
-        <w:t xml:space="preserve">excel_ai/permalink/CPAT-AI-Mitigation-Prototype_latest.xlsm</w:t>
+        <w:t xml:space="preserve">excel_ai/active_workbooks//CPAT-AI-Mitigation-Prototype_latest.xlsm</w:t>
       </w:r>
       <w:r>
         <w:t xml:space="preserve">) in Excel 365 with macros enabled. It opens on</w:t>
@@ -1843,7 +1843,7 @@
         <w:rPr>
           <w:rStyle w:val="VerbatimChar"/>
         </w:rPr>
-        <w:t xml:space="preserve">excel_ai/Legacy_CPAT_Bugs_v&lt;version&gt;.docx</w:t>
+        <w:t xml:space="preserve">excel_ai/bugs_and_legacy/Legacy_CPAT_Bugs_v&lt;version&gt;.docx</w:t>
       </w:r>
       <w:r>
         <w:t xml:space="preserve">; the master list of bugs and issues is the tracker</w:t>
@@ -1855,7 +1855,7 @@
         <w:rPr>
           <w:rStyle w:val="VerbatimChar"/>
         </w:rPr>
-        <w:t xml:space="preserve">excel_ai/Tracking_Legacy_Bugs_v&lt;version&gt;.xlsx</w:t>
+        <w:t xml:space="preserve">excel_ai/bugs_and_legacy/Tracking_Legacy_Bugs_v&lt;version&gt;.xlsx</w:t>
       </w:r>
       <w:r>
         <w:t xml:space="preserve">.</w:t>
@@ -2000,7 +2000,7 @@
         <w:rPr>
           <w:rStyle w:val="VerbatimChar"/>
         </w:rPr>
-        <w:t xml:space="preserve">excel_ai/Tracking_Legacy_Bugs_v1.0.4.xlsx</w:t>
+        <w:t xml:space="preserve">excel_ai/bugs_and_legacy/Tracking_Legacy_Bugs_v1.1.0.xlsx</w:t>
       </w:r>
       <w:r>
         <w:t xml:space="preserve"> </w:t>
@@ -2015,7 +2015,7 @@
         <w:rPr>
           <w:rStyle w:val="VerbatimChar"/>
         </w:rPr>
-        <w:t xml:space="preserve">excel_ai/Legacy_CPAT_Bugs_v1.0.4.docx</w:t>
+        <w:t xml:space="preserve">excel_ai/bugs_and_legacy/Legacy_CPAT_Bugs_v1.1.0.docx</w:t>
       </w:r>
       <w:r>
         <w:t xml:space="preserve">, the rest in these appendices. Codes renumbered in v0.8.4 give their former code.</w:t>
@@ -7488,7 +7488,7 @@
         <w:t xml:space="preserve"> </w:t>
       </w:r>
       <w:r>
-        <w:t xml:space="preserve">v0.7.2 (codes R0-R9): the prototype codes follow the protocol; legacy codes that differ are aliases (crosswalk, LiveOutputs alias column). Open review rows: excel_ai/plans/TODO_Codes.md.</w:t>
+        <w:t xml:space="preserve">v0.7.2 (codes R0-R9): the prototype codes follow the protocol; legacy codes that differ are aliases (crosswalk, LiveOutputs alias column). Open review rows: excel_ai/core/plans/TODO_Codes.md.</w:t>
       </w:r>
       <w:r>
         <w:t xml:space="preserve"> </w:t>
@@ -17428,7 +17428,7 @@
         <w:t xml:space="preserve"> </w:t>
       </w:r>
       <w:r>
-        <w:t xml:space="preserve">column says which) the repository holds a cell-level plan (excel_ai/legacy/bugfixes/data, JSON): for each cell the formula now, the new formula, the range to fill and the policy row. Apply a plan as stage F above: type the new formula in the cell, fill the range, copy the baseline cells onto the policy row given (Paste Special, Formulas), recalculate, then run T1-T7. The plans are printed with each bug in Legacy_CPAT_Bugs_v1.0.4.docx.</w:t>
+        <w:t xml:space="preserve">column says which) the repository holds a cell-level plan (excel_ai/bugs_and_legacy/fixes/data, JSON): for each cell the formula now, the new formula, the range to fill and the policy row. Apply a plan as stage F above: type the new formula in the cell, fill the range, copy the baseline cells onto the policy row given (Paste Special, Formulas), recalculate, then run T1-T7. The plans are printed with each bug in Legacy_CPAT_Bugs_v1.1.0.docx.</w:t>
       </w:r>
     </w:p>
     <w:p>
@@ -17436,7 +17436,7 @@
         <w:pStyle w:val="BodyText"/>
       </w:pPr>
       <w:r>
-        <w:t xml:space="preserve">For bugs without a cell plan yet the bug entry gives the legacy rows, what legacy does and the fix it needs. Write the plan as the existing ones were made (excel_ai/legacy/bugfixes/tools: build the new formula by exact text substitution of the legacy formula, stop if the legacy text is not found, check the brackets), add it to the JSON and regenerate this document.</w:t>
+        <w:t xml:space="preserve">For bugs without a cell plan yet the bug entry gives the legacy rows, what legacy does and the fix it needs. Write the plan as the existing ones were made (excel_ai/bugs_and_legacy/fixes/tools: build the new formula by exact text substitution of the legacy formula, stop if the legacy text is not found, check the brackets), add it to the JSON and regenerate this document.</w:t>
       </w:r>
     </w:p>
     <w:bookmarkEnd w:id="43"/>

</xml_diff>

<commit_message>
Documentation and records in line with 1.2.0: the Master workbook and activation
- Mitigation activation recorded (the committed .xlsb equals the release values to 2035;
  2036-2041 filled); Excel lock files removed from git and ignored
- Mitigation Documentation.md (quick start, tabs, results) and the scenarios section of
  Macro_and_results.md rewritten for the Master; Word documents regenerated
- Website Excel-AI book: new section "How the workbooks work"; chapters 2-4 updated
- QuickStart.md, excel_ai/README.md, NORMS 9.7, USER_TASKS 17, TODO, CAVEATS entry

Co-Authored-By: Claude Opus 5.5 <noreply@anthropic.com>
Claude-Session: https://claude.ai/code/session_01VSHkeKv1tf6y5S1NZ7RBi3
</commit_message>
<xml_diff>
--- a/excel_ai/mitigation/docs/CPAT-AI-Mitigation_Documentation.docx
+++ b/excel_ai/mitigation/docs/CPAT-AI-Mitigation_Documentation.docx
@@ -25,7 +25,7 @@
         <w:t xml:space="preserve"> </w:t>
       </w:r>
       <w:r>
-        <w:t xml:space="preserve">v1.1.0</w:t>
+        <w:t xml:space="preserve">v1.2.0</w:t>
       </w:r>
     </w:p>
     <w:p>
@@ -41,7 +41,7 @@
         <w:pStyle w:val="Date"/>
       </w:pPr>
       <w:r>
-        <w:t xml:space="preserve">2026-10-30</w:t>
+        <w:t xml:space="preserve">2026-10-31</w:t>
       </w:r>
     </w:p>
     <w:sdt>
@@ -171,7 +171,7 @@
         <w:t xml:space="preserve"> </w:t>
       </w:r>
       <w:r>
-        <w:t xml:space="preserve">retail energy prices, fuel use in 16 sectors and 8 fuels, electricity generation and prices, revenue, CO₂ and other greenhouse gases, local air pollutants, GDP effects, the gap to the country’s NDC, and household effects by decile (Distribution tab).</w:t>
+        <w:t xml:space="preserve">retail energy prices, fuel use in 16 sectors and 8 fuels, electricity generation and prices, revenue, CO₂ and other greenhouse gases, local air pollutants, GDP effects, the gap to the country’s NDC, and and the exports the other modules read (section 19; household effects by decile are the separate Distribution module).</w:t>
       </w:r>
     </w:p>
     <w:p>
@@ -202,13 +202,13 @@
         <w:rPr>
           <w:rStyle w:val="VerbatimChar"/>
         </w:rPr>
-        <w:t xml:space="preserve">Settings</w:t>
-      </w:r>
-      <w:r>
-        <w:t xml:space="preserve"> </w:t>
-      </w:r>
-      <w:r>
-        <w:t xml:space="preserve">(C4). The shipped data are complete for Egypt.</w:t>
+        <w:t xml:space="preserve">ScenarioDefinition</w:t>
+      </w:r>
+      <w:r>
+        <w:t xml:space="preserve"> </w:t>
+      </w:r>
+      <w:r>
+        <w:t xml:space="preserve">(MTInputs, Model settings). The shipped data are complete for Egypt.</w:t>
       </w:r>
     </w:p>
     <w:p>
@@ -252,7 +252,7 @@
         <w:t xml:space="preserve"> </w:t>
       </w:r>
       <w:r>
-        <w:t xml:space="preserve">every formula is at most 100 characters and one formula serves a whole block of cells. An independent Python recomputation checks every number.</w:t>
+        <w:t xml:space="preserve">every formula is short (target 90 characters, at most 115) and one formula serves a whole block of cells. An independent Python recomputation checks every number.</w:t>
       </w:r>
     </w:p>
     <w:bookmarkEnd w:id="20"/>
@@ -263,6 +263,107 @@
       </w:pPr>
       <w:r>
         <w:t xml:space="preserve">2. Quick start</w:t>
+      </w:r>
+    </w:p>
+    <w:p>
+      <w:pPr>
+        <w:pStyle w:val="FirstParagraph"/>
+      </w:pPr>
+      <w:r>
+        <w:t xml:space="preserve">Since 1.2.0 the module workbooks have</w:t>
+      </w:r>
+      <w:r>
+        <w:t xml:space="preserve"> </w:t>
+      </w:r>
+      <w:r>
+        <w:rPr>
+          <w:bCs/>
+          <w:b/>
+        </w:rPr>
+        <w:t xml:space="preserve">no macros</w:t>
+      </w:r>
+      <w:r>
+        <w:t xml:space="preserve">. Every macro is in the</w:t>
+      </w:r>
+      <w:r>
+        <w:t xml:space="preserve"> </w:t>
+      </w:r>
+      <w:r>
+        <w:rPr>
+          <w:bCs/>
+          <w:b/>
+        </w:rPr>
+        <w:t xml:space="preserve">Master workbook</w:t>
+      </w:r>
+      <w:r>
+        <w:t xml:space="preserve">,</w:t>
+      </w:r>
+      <w:r>
+        <w:t xml:space="preserve"> </w:t>
+      </w:r>
+      <w:r>
+        <w:rPr>
+          <w:rStyle w:val="VerbatimChar"/>
+        </w:rPr>
+        <w:t xml:space="preserve">excel_ai/active_workbooks/CPAT-AI-Master_UserGuide.xlsm</w:t>
+      </w:r>
+      <w:r>
+        <w:t xml:space="preserve">, which is also the user guide. The mitigation module ships as</w:t>
+      </w:r>
+      <w:r>
+        <w:t xml:space="preserve"> </w:t>
+      </w:r>
+      <w:r>
+        <w:rPr>
+          <w:rStyle w:val="VerbatimChar"/>
+        </w:rPr>
+        <w:t xml:space="preserve">excel_ai/mitigation/CPAT-AI-Mitigation_latest.xlsx</w:t>
+      </w:r>
+      <w:r>
+        <w:t xml:space="preserve"> </w:t>
+      </w:r>
+      <w:r>
+        <w:t xml:space="preserve">(every version in</w:t>
+      </w:r>
+      <w:r>
+        <w:t xml:space="preserve"> </w:t>
+      </w:r>
+      <w:r>
+        <w:rPr>
+          <w:rStyle w:val="VerbatimChar"/>
+        </w:rPr>
+        <w:t xml:space="preserve">excel_ai/mitigation/releases/</w:t>
+      </w:r>
+      <w:r>
+        <w:t xml:space="preserve">) with formulas to 2035, so it is small and quick to open; the Master</w:t>
+      </w:r>
+      <w:r>
+        <w:t xml:space="preserve"> </w:t>
+      </w:r>
+      <w:r>
+        <w:rPr>
+          <w:bCs/>
+          <w:b/>
+        </w:rPr>
+        <w:t xml:space="preserve">activates</w:t>
+      </w:r>
+      <w:r>
+        <w:t xml:space="preserve"> </w:t>
+      </w:r>
+      <w:r>
+        <w:t xml:space="preserve">it into the workbook you work in,</w:t>
+      </w:r>
+      <w:r>
+        <w:t xml:space="preserve"> </w:t>
+      </w:r>
+      <w:r>
+        <w:rPr>
+          <w:rStyle w:val="VerbatimChar"/>
+        </w:rPr>
+        <w:t xml:space="preserve">excel_ai/active_workbooks/CPAT-AI-Mitigation_latest.xlsb</w:t>
+      </w:r>
+      <w:r>
+        <w:t xml:space="preserve">, with formulas to 2041.</w:t>
       </w:r>
     </w:p>
     <w:p>
@@ -278,71 +379,13 @@
           <w:bCs/>
           <w:b/>
         </w:rPr>
-        <w:t xml:space="preserve">Open</w:t>
-      </w:r>
-      <w:r>
-        <w:t xml:space="preserve"> </w:t>
-      </w:r>
-      <w:r>
-        <w:rPr>
-          <w:rStyle w:val="VerbatimChar"/>
-        </w:rPr>
-        <w:t xml:space="preserve">CPAT-AI-Mitigation-Prototype_v&lt;version&gt;.xlsm</w:t>
-      </w:r>
-      <w:r>
-        <w:t xml:space="preserve"> </w:t>
-      </w:r>
-      <w:r>
-        <w:t xml:space="preserve">(in</w:t>
-      </w:r>
-      <w:r>
-        <w:t xml:space="preserve"> </w:t>
-      </w:r>
-      <w:r>
-        <w:rPr>
-          <w:rStyle w:val="VerbatimChar"/>
-        </w:rPr>
-        <w:t xml:space="preserve">excel_ai/</w:t>
-      </w:r>
-      <w:r>
-        <w:t xml:space="preserve">; the same file as</w:t>
-      </w:r>
-      <w:r>
-        <w:t xml:space="preserve"> </w:t>
-      </w:r>
-      <w:r>
-        <w:rPr>
-          <w:rStyle w:val="VerbatimChar"/>
-        </w:rPr>
-        <w:t xml:space="preserve">excel_ai/active_workbooks//CPAT-AI-Mitigation-Prototype_latest.xlsm</w:t>
-      </w:r>
-      <w:r>
-        <w:t xml:space="preserve">) in Excel 365 with macros enabled. It opens on</w:t>
-      </w:r>
-      <w:r>
-        <w:t xml:space="preserve"> </w:t>
-      </w:r>
-      <w:r>
-        <w:rPr>
-          <w:rStyle w:val="VerbatimChar"/>
-        </w:rPr>
-        <w:t xml:space="preserve">ScenarioCompare</w:t>
-      </w:r>
-      <w:r>
-        <w:t xml:space="preserve">, the dashboard,</w:t>
-      </w:r>
-      <w:r>
-        <w:t xml:space="preserve"> </w:t>
-      </w:r>
-      <w:r>
-        <w:rPr>
-          <w:bCs/>
-          <w:b/>
-        </w:rPr>
-        <w:t xml:space="preserve">without recalculating</w:t>
-      </w:r>
-      <w:r>
-        <w:t xml:space="preserve">: the file ships with its values, in manual calculation.</w:t>
+        <w:t xml:space="preserve">Get the files.</w:t>
+      </w:r>
+      <w:r>
+        <w:t xml:space="preserve"> </w:t>
+      </w:r>
+      <w:r>
+        <w:t xml:space="preserve">Keep the repository clone up to date (git, or the SyncRepo script). The Master finds the modules in the clone (else it downloads them from GitHub, the links of its module table).</w:t>
       </w:r>
     </w:p>
     <w:p>
@@ -358,13 +401,64 @@
           <w:bCs/>
           <w:b/>
         </w:rPr>
-        <w:t xml:space="preserve">After any change, click Recalculate now</w:t>
-      </w:r>
-      <w:r>
-        <w:t xml:space="preserve"> </w:t>
-      </w:r>
-      <w:r>
-        <w:t xml:space="preserve">(or switch automatic calculation on with Recalculation on/off).</w:t>
+        <w:t xml:space="preserve">Open the Master</w:t>
+      </w:r>
+      <w:r>
+        <w:t xml:space="preserve"> </w:t>
+      </w:r>
+      <w:r>
+        <w:t xml:space="preserve">(</w:t>
+      </w:r>
+      <w:r>
+        <w:rPr>
+          <w:rStyle w:val="VerbatimChar"/>
+        </w:rPr>
+        <w:t xml:space="preserve">active_workbooks/CPAT-AI-Master_UserGuide.xlsm</w:t>
+      </w:r>
+      <w:r>
+        <w:t xml:space="preserve">) in Excel 365 and enable macros (if the file was downloaded, unblock it first: file Properties &gt; Unblock). Its tab</w:t>
+      </w:r>
+      <w:r>
+        <w:t xml:space="preserve"> </w:t>
+      </w:r>
+      <w:r>
+        <w:rPr>
+          <w:rStyle w:val="VerbatimChar"/>
+        </w:rPr>
+        <w:t xml:space="preserve">UserGuide</w:t>
+      </w:r>
+      <w:r>
+        <w:t xml:space="preserve"> </w:t>
+      </w:r>
+      <w:r>
+        <w:t xml:space="preserve">lists each module (latest version, the</w:t>
+      </w:r>
+      <w:r>
+        <w:t xml:space="preserve"> </w:t>
+      </w:r>
+      <w:r>
+        <w:rPr>
+          <w:rStyle w:val="VerbatimChar"/>
+        </w:rPr>
+        <w:t xml:space="preserve">.xlsx</w:t>
+      </w:r>
+      <w:r>
+        <w:t xml:space="preserve">, its GitHub link, the</w:t>
+      </w:r>
+      <w:r>
+        <w:t xml:space="preserve"> </w:t>
+      </w:r>
+      <w:r>
+        <w:rPr>
+          <w:rStyle w:val="VerbatimChar"/>
+        </w:rPr>
+        <w:t xml:space="preserve">.xlsb</w:t>
+      </w:r>
+      <w:r>
+        <w:t xml:space="preserve"> </w:t>
+      </w:r>
+      <w:r>
+        <w:t xml:space="preserve">it writes, when it was last activated) and has the buttons.</w:t>
       </w:r>
     </w:p>
     <w:p>
@@ -380,13 +474,141 @@
           <w:bCs/>
           <w:b/>
         </w:rPr>
-        <w:t xml:space="preserve">Read the results on ScenarioCompare.</w:t>
-      </w:r>
-      <w:r>
-        <w:t xml:space="preserve"> </w:t>
-      </w:r>
-      <w:r>
-        <w:t xml:space="preserve">Choose Live or Stored results and the year. The key table shows CO₂, GHGs, revenue, the GDP effect and welfare against the baseline; the charts show them over time.</w:t>
+        <w:t xml:space="preserve">Activate:</w:t>
+      </w:r>
+      <w:r>
+        <w:t xml:space="preserve"> </w:t>
+      </w:r>
+      <w:r>
+        <w:t xml:space="preserve">click</w:t>
+      </w:r>
+      <w:r>
+        <w:t xml:space="preserve"> </w:t>
+      </w:r>
+      <w:r>
+        <w:rPr>
+          <w:iCs/>
+          <w:i/>
+        </w:rPr>
+        <w:t xml:space="preserve">Activate Mitigation</w:t>
+      </w:r>
+      <w:r>
+        <w:t xml:space="preserve"> </w:t>
+      </w:r>
+      <w:r>
+        <w:t xml:space="preserve">(or</w:t>
+      </w:r>
+      <w:r>
+        <w:t xml:space="preserve"> </w:t>
+      </w:r>
+      <w:r>
+        <w:rPr>
+          <w:iCs/>
+          <w:i/>
+        </w:rPr>
+        <w:t xml:space="preserve">Activate all modules</w:t>
+      </w:r>
+      <w:r>
+        <w:t xml:space="preserve">). The Master opens the</w:t>
+      </w:r>
+      <w:r>
+        <w:t xml:space="preserve"> </w:t>
+      </w:r>
+      <w:r>
+        <w:rPr>
+          <w:rStyle w:val="VerbatimChar"/>
+        </w:rPr>
+        <w:t xml:space="preserve">.xlsx</w:t>
+      </w:r>
+      <w:r>
+        <w:t xml:space="preserve">, copies the 2035 column of each scenario group of</w:t>
+      </w:r>
+      <w:r>
+        <w:t xml:space="preserve"> </w:t>
+      </w:r>
+      <w:r>
+        <w:rPr>
+          <w:rStyle w:val="VerbatimChar"/>
+        </w:rPr>
+        <w:t xml:space="preserve">Mitigation</w:t>
+      </w:r>
+      <w:r>
+        <w:t xml:space="preserve"> </w:t>
+      </w:r>
+      <w:r>
+        <w:t xml:space="preserve">and</w:t>
+      </w:r>
+      <w:r>
+        <w:t xml:space="preserve"> </w:t>
+      </w:r>
+      <w:r>
+        <w:rPr>
+          <w:rStyle w:val="VerbatimChar"/>
+        </w:rPr>
+        <w:t xml:space="preserve">MTOutputs</w:t>
+      </w:r>
+      <w:r>
+        <w:t xml:space="preserve"> </w:t>
+      </w:r>
+      <w:r>
+        <w:t xml:space="preserve">across to 2041, records the activation on the module’s tab</w:t>
+      </w:r>
+      <w:r>
+        <w:t xml:space="preserve"> </w:t>
+      </w:r>
+      <w:r>
+        <w:rPr>
+          <w:rStyle w:val="VerbatimChar"/>
+        </w:rPr>
+        <w:t xml:space="preserve">FromMaster</w:t>
+      </w:r>
+      <w:r>
+        <w:t xml:space="preserve">, recalculates fully and saves</w:t>
+      </w:r>
+      <w:r>
+        <w:t xml:space="preserve"> </w:t>
+      </w:r>
+      <w:r>
+        <w:rPr>
+          <w:rStyle w:val="VerbatimChar"/>
+        </w:rPr>
+        <w:t xml:space="preserve">CPAT-AI-Mitigation_latest.xlsb</w:t>
+      </w:r>
+      <w:r>
+        <w:t xml:space="preserve"> </w:t>
+      </w:r>
+      <w:r>
+        <w:t xml:space="preserve">next to itself. The workbook stays open. Activate again whenever a new</w:t>
+      </w:r>
+      <w:r>
+        <w:t xml:space="preserve"> </w:t>
+      </w:r>
+      <w:r>
+        <w:rPr>
+          <w:rStyle w:val="VerbatimChar"/>
+        </w:rPr>
+        <w:t xml:space="preserve">.xlsx</w:t>
+      </w:r>
+      <w:r>
+        <w:t xml:space="preserve"> </w:t>
+      </w:r>
+      <w:r>
+        <w:t xml:space="preserve">arrives; the</w:t>
+      </w:r>
+      <w:r>
+        <w:t xml:space="preserve"> </w:t>
+      </w:r>
+      <w:r>
+        <w:rPr>
+          <w:rStyle w:val="VerbatimChar"/>
+        </w:rPr>
+        <w:t xml:space="preserve">.xlsb</w:t>
+      </w:r>
+      <w:r>
+        <w:t xml:space="preserve"> </w:t>
+      </w:r>
+      <w:r>
+        <w:t xml:space="preserve">is a generated file (never merge it on a git conflict: take either side and activate again).</w:t>
       </w:r>
     </w:p>
     <w:p>
@@ -402,40 +624,51 @@
           <w:bCs/>
           <w:b/>
         </w:rPr>
-        <w:t xml:space="preserve">Change a policy</w:t>
-      </w:r>
-      <w:r>
-        <w:t xml:space="preserve"> </w:t>
-      </w:r>
-      <w:r>
-        <w:t xml:space="preserve">on</w:t>
-      </w:r>
-      <w:r>
+        <w:t xml:space="preserve">Work in the</w:t>
+      </w:r>
+      <w:r>
+        <w:rPr>
+          <w:bCs/>
+          <w:b/>
+        </w:rPr>
         <w:t xml:space="preserve"> </w:t>
       </w:r>
       <w:r>
         <w:rPr>
           <w:rStyle w:val="VerbatimChar"/>
-        </w:rPr>
-        <w:t xml:space="preserve">ScenarioDefinition</w:t>
-      </w:r>
-      <w:r>
-        <w:t xml:space="preserve">. Column K is the live scenario: for example change</w:t>
-      </w:r>
-      <w:r>
-        <w:t xml:space="preserve"> </w:t>
-      </w:r>
-      <w:r>
-        <w:rPr>
-          <w:rStyle w:val="VerbatimChar"/>
-        </w:rPr>
-        <w:t xml:space="preserve">CPLevelTarget</w:t>
-      </w:r>
-      <w:r>
-        <w:t xml:space="preserve"> </w:t>
-      </w:r>
-      <w:r>
-        <w:t xml:space="preserve">(carbon price in the target year), then Recalculate now.</w:t>
+          <w:bCs/>
+          <w:b/>
+        </w:rPr>
+        <w:t xml:space="preserve">.xlsb</w:t>
+      </w:r>
+      <w:r>
+        <w:rPr>
+          <w:bCs/>
+          <w:b/>
+        </w:rPr>
+        <w:t xml:space="preserve">.</w:t>
+      </w:r>
+      <w:r>
+        <w:t xml:space="preserve"> </w:t>
+      </w:r>
+      <w:r>
+        <w:t xml:space="preserve">It is in manual calculation:</w:t>
+      </w:r>
+      <w:r>
+        <w:t xml:space="preserve"> </w:t>
+      </w:r>
+      <w:r>
+        <w:rPr>
+          <w:bCs/>
+          <w:b/>
+        </w:rPr>
+        <w:t xml:space="preserve">press F9 after any change</w:t>
+      </w:r>
+      <w:r>
+        <w:t xml:space="preserve"> </w:t>
+      </w:r>
+      <w:r>
+        <w:t xml:space="preserve">(Ctrl+Alt+F9 for a full recalculation).</w:t>
       </w:r>
     </w:p>
     <w:p>
@@ -451,13 +684,13 @@
           <w:bCs/>
           <w:b/>
         </w:rPr>
-        <w:t xml:space="preserve">Store several scenarios:</w:t>
-      </w:r>
-      <w:r>
-        <w:t xml:space="preserve"> </w:t>
-      </w:r>
-      <w:r>
-        <w:t xml:space="preserve">copy a definition one column to the right, give it a short name (row 2) and Run? = Yes (row 4), then click Run stored scenarios. Results go to</w:t>
+        <w:t xml:space="preserve">Change a policy</w:t>
+      </w:r>
+      <w:r>
+        <w:t xml:space="preserve"> </w:t>
+      </w:r>
+      <w:r>
+        <w:t xml:space="preserve">on</w:t>
       </w:r>
       <w:r>
         <w:t xml:space="preserve"> </w:t>
@@ -466,10 +699,28 @@
         <w:rPr>
           <w:rStyle w:val="VerbatimChar"/>
         </w:rPr>
-        <w:t xml:space="preserve">StoredOutputs</w:t>
-      </w:r>
-      <w:r>
-        <w:t xml:space="preserve">; the dashboard compares up to 10.</w:t>
+        <w:t xml:space="preserve">ScenarioDefinition</w:t>
+      </w:r>
+      <w:r>
+        <w:t xml:space="preserve"> </w:t>
+      </w:r>
+      <w:r>
+        <w:t xml:space="preserve">(the legacy MTInputs rows). Column J is the baseline, column K the live policy scenario: for example change</w:t>
+      </w:r>
+      <w:r>
+        <w:t xml:space="preserve"> </w:t>
+      </w:r>
+      <w:r>
+        <w:rPr>
+          <w:rStyle w:val="VerbatimChar"/>
+        </w:rPr>
+        <w:t xml:space="preserve">CPLevelTarget</w:t>
+      </w:r>
+      <w:r>
+        <w:t xml:space="preserve"> </w:t>
+      </w:r>
+      <w:r>
+        <w:t xml:space="preserve">(the carbon price in the target year), then F9. Columns L onwards are scenario definitions for the batch run.</w:t>
       </w:r>
     </w:p>
     <w:p>
@@ -485,13 +736,13 @@
           <w:bCs/>
           <w:b/>
         </w:rPr>
-        <w:t xml:space="preserve">Update the data</w:t>
-      </w:r>
-      <w:r>
-        <w:t xml:space="preserve"> </w:t>
-      </w:r>
-      <w:r>
-        <w:t xml:space="preserve">from the data workbook: choose the source on</w:t>
+        <w:t xml:space="preserve">Read the results</w:t>
+      </w:r>
+      <w:r>
+        <w:t xml:space="preserve"> </w:t>
+      </w:r>
+      <w:r>
+        <w:t xml:space="preserve">on</w:t>
       </w:r>
       <w:r>
         <w:t xml:space="preserve"> </w:t>
@@ -500,22 +751,28 @@
         <w:rPr>
           <w:rStyle w:val="VerbatimChar"/>
         </w:rPr>
+        <w:t xml:space="preserve">MTOutputs</w:t>
+      </w:r>
+      <w:r>
+        <w:t xml:space="preserve"> </w:t>
+      </w:r>
+      <w:r>
+        <w:t xml:space="preserve">(every scenario group side by side, by output code) and</w:t>
+      </w:r>
+      <w:r>
+        <w:t xml:space="preserve"> </w:t>
+      </w:r>
+      <w:r>
+        <w:rPr>
+          <w:rStyle w:val="VerbatimChar"/>
+        </w:rPr>
         <w:t xml:space="preserve">ScenarioCompare</w:t>
       </w:r>
       <w:r>
-        <w:t xml:space="preserve">, click Update data tables. The status is on</w:t>
-      </w:r>
-      <w:r>
-        <w:t xml:space="preserve"> </w:t>
-      </w:r>
-      <w:r>
-        <w:rPr>
-          <w:rStyle w:val="VerbatimChar"/>
-        </w:rPr>
-        <w:t xml:space="preserve">Cover</w:t>
-      </w:r>
-      <w:r>
-        <w:t xml:space="preserve">.</w:t>
+        <w:t xml:space="preserve"> </w:t>
+      </w:r>
+      <w:r>
+        <w:t xml:space="preserve">(the dashboard: choose the year; key table and time-series charts of the live scenarios against the baseline).</w:t>
       </w:r>
     </w:p>
     <w:p>
@@ -531,13 +788,218 @@
           <w:bCs/>
           <w:b/>
         </w:rPr>
-        <w:t xml:space="preserve">First time only:</w:t>
-      </w:r>
-      <w:r>
-        <w:t xml:space="preserve"> </w:t>
-      </w:r>
-      <w:r>
-        <w:t xml:space="preserve">click First-run test (grey buttons). The check table must show PASS.</w:t>
+        <w:t xml:space="preserve">Store and compare scenarios</w:t>
+      </w:r>
+      <w:r>
+        <w:t xml:space="preserve"> </w:t>
+      </w:r>
+      <w:r>
+        <w:t xml:space="preserve">in the Master:</w:t>
+      </w:r>
+      <w:r>
+        <w:t xml:space="preserve"> </w:t>
+      </w:r>
+      <w:r>
+        <w:rPr>
+          <w:iCs/>
+          <w:i/>
+        </w:rPr>
+        <w:t xml:space="preserve">Store live scenarios</w:t>
+      </w:r>
+      <w:r>
+        <w:t xml:space="preserve"> </w:t>
+      </w:r>
+      <w:r>
+        <w:t xml:space="preserve">copies the scenario groups of</w:t>
+      </w:r>
+      <w:r>
+        <w:t xml:space="preserve"> </w:t>
+      </w:r>
+      <w:r>
+        <w:rPr>
+          <w:rStyle w:val="VerbatimChar"/>
+        </w:rPr>
+        <w:t xml:space="preserve">MTOutputs</w:t>
+      </w:r>
+      <w:r>
+        <w:t xml:space="preserve"> </w:t>
+      </w:r>
+      <w:r>
+        <w:t xml:space="preserve">into its</w:t>
+      </w:r>
+      <w:r>
+        <w:t xml:space="preserve"> </w:t>
+      </w:r>
+      <w:r>
+        <w:rPr>
+          <w:rStyle w:val="VerbatimChar"/>
+        </w:rPr>
+        <w:t xml:space="preserve">StoredScenarios</w:t>
+      </w:r>
+      <w:r>
+        <w:t xml:space="preserve"> </w:t>
+      </w:r>
+      <w:r>
+        <w:t xml:space="preserve">(values, ten slots);</w:t>
+      </w:r>
+      <w:r>
+        <w:t xml:space="preserve"> </w:t>
+      </w:r>
+      <w:r>
+        <w:rPr>
+          <w:iCs/>
+          <w:i/>
+        </w:rPr>
+        <w:t xml:space="preserve">Run stored scenarios</w:t>
+      </w:r>
+      <w:r>
+        <w:t xml:space="preserve"> </w:t>
+      </w:r>
+      <w:r>
+        <w:t xml:space="preserve">runs every definition with Run? = Yes through the live column K (ETS goal seek where needed) and stores each;</w:t>
+      </w:r>
+      <w:r>
+        <w:t xml:space="preserve"> </w:t>
+      </w:r>
+      <w:r>
+        <w:rPr>
+          <w:rStyle w:val="VerbatimChar"/>
+        </w:rPr>
+        <w:t xml:space="preserve">CompareStored</w:t>
+      </w:r>
+      <w:r>
+        <w:t xml:space="preserve"> </w:t>
+      </w:r>
+      <w:r>
+        <w:t xml:space="preserve">compares them.</w:t>
+      </w:r>
+      <w:r>
+        <w:t xml:space="preserve"> </w:t>
+      </w:r>
+      <w:r>
+        <w:rPr>
+          <w:iCs/>
+          <w:i/>
+        </w:rPr>
+        <w:t xml:space="preserve">Clear stored scenarios</w:t>
+      </w:r>
+      <w:r>
+        <w:t xml:space="preserve"> </w:t>
+      </w:r>
+      <w:r>
+        <w:t xml:space="preserve">empties every slot but the baseline.</w:t>
+      </w:r>
+    </w:p>
+    <w:p>
+      <w:pPr>
+        <w:numPr>
+          <w:ilvl w:val="0"/>
+          <w:numId w:val="1002"/>
+        </w:numPr>
+        <w:pStyle w:val="Compact"/>
+      </w:pPr>
+      <w:r>
+        <w:rPr>
+          <w:bCs/>
+          <w:b/>
+        </w:rPr>
+        <w:t xml:space="preserve">Update the data</w:t>
+      </w:r>
+      <w:r>
+        <w:t xml:space="preserve"> </w:t>
+      </w:r>
+      <w:r>
+        <w:t xml:space="preserve">in the Master: choose the data source and the rows (one country or all countries) on its tab</w:t>
+      </w:r>
+      <w:r>
+        <w:t xml:space="preserve"> </w:t>
+      </w:r>
+      <w:r>
+        <w:rPr>
+          <w:rStyle w:val="VerbatimChar"/>
+        </w:rPr>
+        <w:t xml:space="preserve">Settings</w:t>
+      </w:r>
+      <w:r>
+        <w:t xml:space="preserve">, then</w:t>
+      </w:r>
+      <w:r>
+        <w:t xml:space="preserve"> </w:t>
+      </w:r>
+      <w:r>
+        <w:rPr>
+          <w:iCs/>
+          <w:i/>
+        </w:rPr>
+        <w:t xml:space="preserve">Update data tables</w:t>
+      </w:r>
+      <w:r>
+        <w:t xml:space="preserve"> </w:t>
+      </w:r>
+      <w:r>
+        <w:t xml:space="preserve">(Power Query). The mitigation workbook records the source on</w:t>
+      </w:r>
+      <w:r>
+        <w:t xml:space="preserve"> </w:t>
+      </w:r>
+      <w:r>
+        <w:rPr>
+          <w:rStyle w:val="VerbatimChar"/>
+        </w:rPr>
+        <w:t xml:space="preserve">FromMaster</w:t>
+      </w:r>
+      <w:r>
+        <w:t xml:space="preserve">; the status is on its</w:t>
+      </w:r>
+      <w:r>
+        <w:t xml:space="preserve"> </w:t>
+      </w:r>
+      <w:r>
+        <w:rPr>
+          <w:rStyle w:val="VerbatimChar"/>
+        </w:rPr>
+        <w:t xml:space="preserve">Cover</w:t>
+      </w:r>
+      <w:r>
+        <w:t xml:space="preserve">.</w:t>
+      </w:r>
+    </w:p>
+    <w:p>
+      <w:pPr>
+        <w:numPr>
+          <w:ilvl w:val="0"/>
+          <w:numId w:val="1002"/>
+        </w:numPr>
+        <w:pStyle w:val="Compact"/>
+      </w:pPr>
+      <w:r>
+        <w:rPr>
+          <w:bCs/>
+          <w:b/>
+        </w:rPr>
+        <w:t xml:space="preserve">Distribution:</w:t>
+      </w:r>
+      <w:r>
+        <w:t xml:space="preserve"> </w:t>
+      </w:r>
+      <w:r>
+        <w:t xml:space="preserve">activate the distribution module too, then</w:t>
+      </w:r>
+      <w:r>
+        <w:t xml:space="preserve"> </w:t>
+      </w:r>
+      <w:r>
+        <w:rPr>
+          <w:iCs/>
+          <w:i/>
+        </w:rPr>
+        <w:t xml:space="preserve">Update Distribution from Mitigation</w:t>
+      </w:r>
+      <w:r>
+        <w:t xml:space="preserve"> </w:t>
+      </w:r>
+      <w:r>
+        <w:t xml:space="preserve">copies section 19a of the activated mitigation workbook into it, recalculates and saves it.</w:t>
       </w:r>
     </w:p>
     <w:p>
@@ -545,6 +1007,14 @@
         <w:pStyle w:val="FirstParagraph"/>
       </w:pPr>
       <w:r>
+        <w:t xml:space="preserve">Run a module for a particular country on your local drive; a workbook holding real data is never committed.</w:t>
+      </w:r>
+    </w:p>
+    <w:p>
+      <w:pPr>
+        <w:pStyle w:val="BodyText"/>
+      </w:pPr>
+      <w:r>
         <w:t xml:space="preserve">The tabs, left to right: the front (</w:t>
       </w:r>
       <w:r>
@@ -563,9 +1033,93 @@
         <w:rPr>
           <w:rStyle w:val="VerbatimChar"/>
         </w:rPr>
+        <w:t xml:space="preserve">ScenarioDefinition</w:t>
+      </w:r>
+      <w:r>
+        <w:t xml:space="preserve">),</w:t>
+      </w:r>
+      <w:r>
+        <w:t xml:space="preserve"> </w:t>
+      </w:r>
+      <w:r>
+        <w:rPr>
+          <w:rStyle w:val="VerbatimChar"/>
+        </w:rPr>
+        <w:t xml:space="preserve">MAIN-&gt;&gt;</w:t>
+      </w:r>
+      <w:r>
+        <w:t xml:space="preserve"> </w:t>
+      </w:r>
+      <w:r>
+        <w:t xml:space="preserve">(</w:t>
+      </w:r>
+      <w:r>
+        <w:rPr>
+          <w:rStyle w:val="VerbatimChar"/>
+        </w:rPr>
+        <w:t xml:space="preserve">Mitigation</w:t>
+      </w:r>
+      <w:r>
+        <w:t xml:space="preserve">),</w:t>
+      </w:r>
+      <w:r>
+        <w:t xml:space="preserve"> </w:t>
+      </w:r>
+      <w:r>
+        <w:rPr>
+          <w:rStyle w:val="VerbatimChar"/>
+        </w:rPr>
+        <w:t xml:space="preserve">OUTPUT-&gt;&gt;</w:t>
+      </w:r>
+      <w:r>
+        <w:t xml:space="preserve"> </w:t>
+      </w:r>
+      <w:r>
+        <w:t xml:space="preserve">(</w:t>
+      </w:r>
+      <w:r>
+        <w:rPr>
+          <w:rStyle w:val="VerbatimChar"/>
+        </w:rPr>
+        <w:t xml:space="preserve">MTOutputs</w:t>
+      </w:r>
+      <w:r>
+        <w:t xml:space="preserve">,</w:t>
+      </w:r>
+      <w:r>
+        <w:t xml:space="preserve"> </w:t>
+      </w:r>
+      <w:r>
+        <w:rPr>
+          <w:rStyle w:val="VerbatimChar"/>
+        </w:rPr>
         <w:t xml:space="preserve">ScenarioCompare</w:t>
       </w:r>
       <w:r>
+        <w:t xml:space="preserve">),</w:t>
+      </w:r>
+      <w:r>
+        <w:t xml:space="preserve"> </w:t>
+      </w:r>
+      <w:r>
+        <w:rPr>
+          <w:rStyle w:val="VerbatimChar"/>
+        </w:rPr>
+        <w:t xml:space="preserve">INPUTS-&gt;&gt;</w:t>
+      </w:r>
+      <w:r>
+        <w:t xml:space="preserve"> </w:t>
+      </w:r>
+      <w:r>
+        <w:t xml:space="preserve">(</w:t>
+      </w:r>
+      <w:r>
+        <w:rPr>
+          <w:rStyle w:val="VerbatimChar"/>
+        </w:rPr>
+        <w:t xml:space="preserve">Manual inputs</w:t>
+      </w:r>
+      <w:r>
         <w:t xml:space="preserve">,</w:t>
       </w:r>
       <w:r>
@@ -575,19 +1129,162 @@
         <w:rPr>
           <w:rStyle w:val="VerbatimChar"/>
         </w:rPr>
-        <w:t xml:space="preserve">ScenarioDefinition</w:t>
-      </w:r>
-      <w:r>
-        <w:t xml:space="preserve">), the model (</w:t>
+        <w:t xml:space="preserve">Constants and Mappings</w:t>
+      </w:r>
+      <w:r>
+        <w:t xml:space="preserve">),</w:t>
+      </w:r>
+      <w:r>
+        <w:t xml:space="preserve"> </w:t>
       </w:r>
       <w:r>
         <w:rPr>
           <w:rStyle w:val="VerbatimChar"/>
         </w:rPr>
+        <w:t xml:space="preserve">OTHER MODULES-&gt;&gt;</w:t>
+      </w:r>
+      <w:r>
+        <w:t xml:space="preserve"> </w:t>
+      </w:r>
+      <w:r>
+        <w:t xml:space="preserve">(</w:t>
+      </w:r>
+      <w:r>
+        <w:rPr>
+          <w:rStyle w:val="VerbatimChar"/>
+        </w:rPr>
+        <w:t xml:space="preserve">FromMaster</w:t>
+      </w:r>
+      <w:r>
+        <w:t xml:space="preserve">,</w:t>
+      </w:r>
+      <w:r>
+        <w:t xml:space="preserve"> </w:t>
+      </w:r>
+      <w:r>
+        <w:rPr>
+          <w:rStyle w:val="VerbatimChar"/>
+        </w:rPr>
+        <w:t xml:space="preserve">FromAirPollution</w:t>
+      </w:r>
+      <w:r>
+        <w:t xml:space="preserve">,</w:t>
+      </w:r>
+      <w:r>
+        <w:t xml:space="preserve"> </w:t>
+      </w:r>
+      <w:r>
+        <w:rPr>
+          <w:rStyle w:val="VerbatimChar"/>
+        </w:rPr>
+        <w:t xml:space="preserve">FromTransportCB</w:t>
+      </w:r>
+      <w:r>
+        <w:t xml:space="preserve">), the data tabs (</w:t>
+      </w:r>
+      <w:r>
+        <w:rPr>
+          <w:rStyle w:val="VerbatimChar"/>
+        </w:rPr>
+        <w:t xml:space="preserve">DATA_MITIGATION-&gt;&gt;</w:t>
+      </w:r>
+      <w:r>
+        <w:t xml:space="preserve">,</w:t>
+      </w:r>
+      <w:r>
+        <w:t xml:space="preserve"> </w:t>
+      </w:r>
+      <w:r>
+        <w:rPr>
+          <w:rStyle w:val="VerbatimChar"/>
+        </w:rPr>
+        <w:t xml:space="preserve">DATA_TRAN-&gt;&gt;</w:t>
+      </w:r>
+      <w:r>
+        <w:t xml:space="preserve">,</w:t>
+      </w:r>
+      <w:r>
+        <w:t xml:space="preserve"> </w:t>
+      </w:r>
+      <w:r>
+        <w:rPr>
+          <w:rStyle w:val="VerbatimChar"/>
+        </w:rPr>
+        <w:t xml:space="preserve">DATA_OUTPUT-&gt;&gt;</w:t>
+      </w:r>
+      <w:r>
+        <w:t xml:space="preserve">,</w:t>
+      </w:r>
+      <w:r>
+        <w:t xml:space="preserve"> </w:t>
+      </w:r>
+      <w:r>
+        <w:rPr>
+          <w:rStyle w:val="VerbatimChar"/>
+        </w:rPr>
+        <w:t xml:space="preserve">DATA_OTHER-&gt;&gt;</w:t>
+      </w:r>
+      <w:r>
+        <w:t xml:space="preserve">: legacy tables, unchanged) and</w:t>
+      </w:r>
+      <w:r>
+        <w:t xml:space="preserve"> </w:t>
+      </w:r>
+      <w:r>
+        <w:rPr>
+          <w:rStyle w:val="VerbatimChar"/>
+        </w:rPr>
+        <w:t xml:space="preserve">REF-&gt;&gt;</w:t>
+      </w:r>
+      <w:r>
+        <w:t xml:space="preserve"> </w:t>
+      </w:r>
+      <w:r>
+        <w:t xml:space="preserve">(version log, differences with legacy, variable dictionary and LAMBDAs).</w:t>
+      </w:r>
+    </w:p>
+    <w:bookmarkEnd w:id="21"/>
+    <w:bookmarkStart w:id="32" w:name="how-it-works"/>
+    <w:p>
+      <w:pPr>
+        <w:pStyle w:val="Heading1"/>
+      </w:pPr>
+      <w:r>
+        <w:t xml:space="preserve">3. How it works</w:t>
+      </w:r>
+    </w:p>
+    <w:p>
+      <w:pPr>
+        <w:pStyle w:val="FirstParagraph"/>
+      </w:pPr>
+      <w:r>
+        <w:t xml:space="preserve">The</w:t>
+      </w:r>
+      <w:r>
+        <w:t xml:space="preserve"> </w:t>
+      </w:r>
+      <w:r>
+        <w:rPr>
+          <w:rStyle w:val="VerbatimChar"/>
+        </w:rPr>
         <w:t xml:space="preserve">Mitigation</w:t>
       </w:r>
       <w:r>
-        <w:t xml:space="preserve">,</w:t>
+        <w:t xml:space="preserve"> </w:t>
+      </w:r>
+      <w:r>
+        <w:t xml:space="preserve">tab runs top to bottom, one section per step, with the section numbers of legacy CPAT. The method of each block, with its equations and pseudocode, is in the website’s CPAT-AI Model tab (</w:t>
+      </w:r>
+      <w:hyperlink r:id="rId22">
+        <w:r>
+          <w:rPr>
+            <w:rStyle w:val="Hyperlink"/>
+          </w:rPr>
+          <w:t xml:space="preserve">https://cpmodelai.github.io/cpat_ai/#model</w:t>
+        </w:r>
+      </w:hyperlink>
+      <w:r>
+        <w:t xml:space="preserve">; sources</w:t>
       </w:r>
       <w:r>
         <w:t xml:space="preserve"> </w:t>
@@ -596,100 +1293,19 @@
         <w:rPr>
           <w:rStyle w:val="VerbatimChar"/>
         </w:rPr>
-        <w:t xml:space="preserve">Distribution</w:t>
-      </w:r>
-      <w:r>
-        <w:t xml:space="preserve">,</w:t>
-      </w:r>
-      <w:r>
-        <w:t xml:space="preserve"> </w:t>
+        <w:t xml:space="preserve">docs/CPAT_model_documentation_qmd/</w:t>
+      </w:r>
+      <w:r>
+        <w:t xml:space="preserve">), shared with CPAT Python; the Word Methods volume (</w:t>
       </w:r>
       <w:r>
         <w:rPr>
           <w:rStyle w:val="VerbatimChar"/>
         </w:rPr>
-        <w:t xml:space="preserve">MTOutputs</w:t>
-      </w:r>
-      <w:r>
-        <w:t xml:space="preserve">,</w:t>
-      </w:r>
-      <w:r>
-        <w:t xml:space="preserve"> </w:t>
-      </w:r>
-      <w:r>
-        <w:rPr>
-          <w:rStyle w:val="VerbatimChar"/>
-        </w:rPr>
-        <w:t xml:space="preserve">StoredOutputs</w:t>
-      </w:r>
-      <w:r>
-        <w:t xml:space="preserve">), the inputs (</w:t>
-      </w:r>
-      <w:r>
-        <w:rPr>
-          <w:rStyle w:val="VerbatimChar"/>
-        </w:rPr>
-        <w:t xml:space="preserve">Manual inputs</w:t>
-      </w:r>
-      <w:r>
-        <w:t xml:space="preserve">,</w:t>
-      </w:r>
-      <w:r>
-        <w:t xml:space="preserve"> </w:t>
-      </w:r>
-      <w:r>
-        <w:rPr>
-          <w:rStyle w:val="VerbatimChar"/>
-        </w:rPr>
-        <w:t xml:space="preserve">Settings</w:t>
-      </w:r>
-      <w:r>
-        <w:t xml:space="preserve">,</w:t>
-      </w:r>
-      <w:r>
-        <w:t xml:space="preserve"> </w:t>
-      </w:r>
-      <w:r>
-        <w:rPr>
-          <w:rStyle w:val="VerbatimChar"/>
-        </w:rPr>
-        <w:t xml:space="preserve">Inputs</w:t>
-      </w:r>
-      <w:r>
-        <w:t xml:space="preserve">), the data tabs (legacy tables, unchanged), and the reference tabs (version log, differences with legacy, variable dictionary).</w:t>
-      </w:r>
-    </w:p>
-    <w:bookmarkEnd w:id="21"/>
-    <w:bookmarkStart w:id="31" w:name="how-it-works"/>
-    <w:p>
-      <w:pPr>
-        <w:pStyle w:val="Heading1"/>
-      </w:pPr>
-      <w:r>
-        <w:t xml:space="preserve">3. How it works</w:t>
-      </w:r>
-    </w:p>
-    <w:p>
-      <w:pPr>
-        <w:pStyle w:val="FirstParagraph"/>
-      </w:pPr>
-      <w:r>
-        <w:t xml:space="preserve">The</w:t>
-      </w:r>
-      <w:r>
-        <w:t xml:space="preserve"> </w:t>
-      </w:r>
-      <w:r>
-        <w:rPr>
-          <w:rStyle w:val="VerbatimChar"/>
-        </w:rPr>
-        <w:t xml:space="preserve">Mitigation</w:t>
-      </w:r>
-      <w:r>
-        <w:t xml:space="preserve"> </w:t>
-      </w:r>
-      <w:r>
-        <w:t xml:space="preserve">tab runs top to bottom, one section per step, with the section numbers of legacy CPAT. Each scenario is a group of columns: group 1 is the baseline, group 2 the live scenario. Years run across, 2022 to 2041.</w:t>
+        <w:t xml:space="preserve">docs/methods/</w:t>
+      </w:r>
+      <w:r>
+        <w:t xml:space="preserve">) is the compact version. Each scenario is a group of columns: group 1 is the baseline, group 2 the live scenario (further groups: copy group 2 to the right; MTOutputs has room for four). Years run across, 2022 to 2041.</w:t>
       </w:r>
     </w:p>
     <w:tbl>
@@ -1088,7 +1704,7 @@
         </w:tc>
       </w:tr>
     </w:tbl>
-    <w:bookmarkStart w:id="22" w:name="policies-section-1"/>
+    <w:bookmarkStart w:id="23" w:name="policies-section-1"/>
     <w:p>
       <w:pPr>
         <w:pStyle w:val="Heading2"/>
@@ -1148,8 +1764,8 @@
         <w:t xml:space="preserve">Details: Methods, chapter Prices; chapter ETS.</w:t>
       </w:r>
     </w:p>
-    <w:bookmarkEnd w:id="22"/>
-    <w:bookmarkStart w:id="23" w:name="energy-prices-section-2"/>
+    <w:bookmarkEnd w:id="23"/>
+    <w:bookmarkStart w:id="24" w:name="energy-prices-section-2"/>
     <w:p>
       <w:pPr>
         <w:pStyle w:val="Heading2"/>
@@ -1215,8 +1831,8 @@
         <w:t xml:space="preserve">Details: Methods, chapter Prices.</w:t>
       </w:r>
     </w:p>
-    <w:bookmarkEnd w:id="23"/>
-    <w:bookmarkStart w:id="24" w:name="energy-demand-sections-5-8-11"/>
+    <w:bookmarkEnd w:id="24"/>
+    <w:bookmarkStart w:id="25" w:name="energy-demand-sections-5-8-11"/>
     <w:p>
       <w:pPr>
         <w:pStyle w:val="Heading2"/>
@@ -1264,8 +1880,8 @@
         <w:t xml:space="preserve">Details: Methods, appendix A (equations, section 4); chapter Transport for road.</w:t>
       </w:r>
     </w:p>
-    <w:bookmarkEnd w:id="24"/>
-    <w:bookmarkStart w:id="25" w:name="power-section-3"/>
+    <w:bookmarkEnd w:id="25"/>
+    <w:bookmarkStart w:id="26" w:name="power-section-3"/>
     <w:p>
       <w:pPr>
         <w:pStyle w:val="Heading2"/>
@@ -1368,8 +1984,8 @@
         <w:t xml:space="preserve">Details: Methods, chapter Power.</w:t>
       </w:r>
     </w:p>
-    <w:bookmarkEnd w:id="25"/>
-    <w:bookmarkStart w:id="26" w:name="road-transport-sections-5-5b"/>
+    <w:bookmarkEnd w:id="26"/>
+    <w:bookmarkStart w:id="27" w:name="road-transport-sections-5-5b"/>
     <w:p>
       <w:pPr>
         <w:pStyle w:val="Heading2"/>
@@ -1413,8 +2029,8 @@
         <w:t xml:space="preserve">Details: Methods, chapter Transport.</w:t>
       </w:r>
     </w:p>
-    <w:bookmarkEnd w:id="26"/>
-    <w:bookmarkStart w:id="27" w:name="revenues-section-12"/>
+    <w:bookmarkEnd w:id="27"/>
+    <w:bookmarkStart w:id="28" w:name="revenues-section-12"/>
     <w:p>
       <w:pPr>
         <w:pStyle w:val="Heading2"/>
@@ -1471,8 +2087,8 @@
         <w:t xml:space="preserve">Details: Methods, chapter Macro and results.</w:t>
       </w:r>
     </w:p>
-    <w:bookmarkEnd w:id="27"/>
-    <w:bookmarkStart w:id="28" w:name="emissions-sections-13-15"/>
+    <w:bookmarkEnd w:id="28"/>
+    <w:bookmarkStart w:id="29" w:name="emissions-sections-13-15"/>
     <w:p>
       <w:pPr>
         <w:pStyle w:val="Heading2"/>
@@ -1512,8 +2128,8 @@
         <w:t xml:space="preserve">Details: Methods, chapter Emissions.</w:t>
       </w:r>
     </w:p>
-    <w:bookmarkEnd w:id="28"/>
-    <w:bookmarkStart w:id="29" w:name="X635412f5ce879631d5354ae87e640895b1c3b66"/>
+    <w:bookmarkEnd w:id="29"/>
+    <w:bookmarkStart w:id="30" w:name="X635412f5ce879631d5354ae87e640895b1c3b66"/>
     <w:p>
       <w:pPr>
         <w:pStyle w:val="Heading2"/>
@@ -1570,14 +2186,14 @@
         <w:t xml:space="preserve">Details: Methods, chapter Macro and results.</w:t>
       </w:r>
     </w:p>
-    <w:bookmarkEnd w:id="29"/>
-    <w:bookmarkStart w:id="30" w:name="distribution-tab-distribution"/>
+    <w:bookmarkEnd w:id="30"/>
+    <w:bookmarkStart w:id="31" w:name="exports-to-the-other-modules-section-19"/>
     <w:p>
       <w:pPr>
         <w:pStyle w:val="Heading2"/>
       </w:pPr>
       <w:r>
-        <w:t xml:space="preserve">3.9 Distribution (tab Distribution)</w:t>
+        <w:t xml:space="preserve">3.9 Exports to the other modules (section 19)</w:t>
       </w:r>
     </w:p>
     <w:p>
@@ -1585,7 +2201,29 @@
         <w:pStyle w:val="FirstParagraph"/>
       </w:pPr>
       <w:r>
-        <w:t xml:space="preserve">Household effects by decile in one analysis year: price changes reach households directly (energy) and indirectly (other goods, through the input-output table); revenue recycling (transfers, targeted by ASPIRE or the poverty line) offsets them.</w:t>
+        <w:t xml:space="preserve">Section 19 holds what the other modules read, by code: section 19a (defined name</w:t>
+      </w:r>
+      <w:r>
+        <w:t xml:space="preserve"> </w:t>
+      </w:r>
+      <w:r>
+        <w:rPr>
+          <w:rStyle w:val="VerbatimChar"/>
+        </w:rPr>
+        <w:t xml:space="preserve">ExportDistn</w:t>
+      </w:r>
+      <w:r>
+        <w:t xml:space="preserve">) is the input of the Distribution module (household effects by decile in one analysis year: price changes reach households directly and indirectly, revenue recycling offsets them). The Master copies it into the distribution workbook (</w:t>
+      </w:r>
+      <w:r>
+        <w:rPr>
+          <w:iCs/>
+          <w:i/>
+        </w:rPr>
+        <w:t xml:space="preserve">Update Distribution from Mitigation</w:t>
+      </w:r>
+      <w:r>
+        <w:t xml:space="preserve">).</w:t>
       </w:r>
     </w:p>
     <w:p>
@@ -1597,36 +2235,40 @@
           <w:iCs/>
           <w:i/>
         </w:rPr>
-        <w:t xml:space="preserve">Details: Methods, chapter Distribution.</w:t>
-      </w:r>
-    </w:p>
-    <w:bookmarkEnd w:id="30"/>
+        <w:t xml:space="preserve">Details: CPAT-AI Model, chapter Distribution;</w:t>
+      </w:r>
+      <w:r>
+        <w:rPr>
+          <w:iCs/>
+          <w:i/>
+        </w:rPr>
+        <w:t xml:space="preserve"> </w:t>
+      </w:r>
+      <w:r>
+        <w:rPr>
+          <w:rStyle w:val="VerbatimChar"/>
+          <w:iCs/>
+          <w:i/>
+        </w:rPr>
+        <w:t xml:space="preserve">excel_ai/distribution/README.md</w:t>
+      </w:r>
+      <w:r>
+        <w:rPr>
+          <w:iCs/>
+          <w:i/>
+        </w:rPr>
+        <w:t xml:space="preserve">.</w:t>
+      </w:r>
+    </w:p>
     <w:bookmarkEnd w:id="31"/>
-    <w:bookmarkStart w:id="32" w:name="results-and-the-dashboard"/>
+    <w:bookmarkEnd w:id="32"/>
+    <w:bookmarkStart w:id="33" w:name="results-and-the-dashboard"/>
     <w:p>
       <w:pPr>
         <w:pStyle w:val="Heading1"/>
       </w:pPr>
       <w:r>
         <w:t xml:space="preserve">4. Results and the dashboard</w:t>
-      </w:r>
-    </w:p>
-    <w:p>
-      <w:pPr>
-        <w:pStyle w:val="FirstParagraph"/>
-      </w:pPr>
-      <w:r>
-        <w:rPr>
-          <w:bCs/>
-          <w:b/>
-        </w:rPr>
-        <w:t xml:space="preserve">ScenarioCompare</w:t>
-      </w:r>
-      <w:r>
-        <w:t xml:space="preserve"> </w:t>
-      </w:r>
-      <w:r>
-        <w:t xml:space="preserve">is the place to read results:</w:t>
       </w:r>
     </w:p>
     <w:p>
@@ -1642,13 +2284,13 @@
           <w:bCs/>
           <w:b/>
         </w:rPr>
-        <w:t xml:space="preserve">Choices:</w:t>
-      </w:r>
-      <w:r>
-        <w:t xml:space="preserve"> </w:t>
-      </w:r>
-      <w:r>
-        <w:t xml:space="preserve">Live (the scenario groups of</w:t>
+        <w:t xml:space="preserve">MTOutputs</w:t>
+      </w:r>
+      <w:r>
+        <w:t xml:space="preserve"> </w:t>
+      </w:r>
+      <w:r>
+        <w:t xml:space="preserve">shows the key results of every live scenario side by side, in the columns of the scenario groups of</w:t>
       </w:r>
       <w:r>
         <w:t xml:space="preserve"> </w:t>
@@ -1660,7 +2302,22 @@
         <w:t xml:space="preserve">Mitigation</w:t>
       </w:r>
       <w:r>
-        <w:t xml:space="preserve">) or Stored (every stored scenario), and the year.</w:t>
+        <w:t xml:space="preserve"> </w:t>
+      </w:r>
+      <w:r>
+        <w:t xml:space="preserve">(row 5: the scenario number; rows as legacy MTOutputs, then the outputs legacy does not list, by topic). Every row carries a code (for example</w:t>
+      </w:r>
+      <w:r>
+        <w:t xml:space="preserve"> </w:t>
+      </w:r>
+      <w:r>
+        <w:rPr>
+          <w:rStyle w:val="VerbatimChar"/>
+        </w:rPr>
+        <w:t xml:space="preserve">egy.mit.co2.tot.tot.2</w:t>
+      </w:r>
+      <w:r>
+        <w:t xml:space="preserve">: country, module, variable, sector, fuel, scenario), the same codes as the Python model.</w:t>
       </w:r>
     </w:p>
     <w:p>
@@ -1676,13 +2333,13 @@
           <w:bCs/>
           <w:b/>
         </w:rPr>
-        <w:t xml:space="preserve">Key table:</w:t>
-      </w:r>
-      <w:r>
-        <w:t xml:space="preserve"> </w:t>
-      </w:r>
-      <w:r>
-        <w:t xml:space="preserve">energy CO₂, GHGs, revenue, GDP effect and welfare, as levels and differences from the baseline.</w:t>
+        <w:t xml:space="preserve">ScenarioCompare</w:t>
+      </w:r>
+      <w:r>
+        <w:t xml:space="preserve"> </w:t>
+      </w:r>
+      <w:r>
+        <w:t xml:space="preserve">(the dashboard) reads MTOutputs only (live results): one slot per scenario group, the year, a key table (energy CO₂, GHGs, revenue, GDP effect and welfare: level, difference and % difference from the baseline) and four time series with their line charts; the title of each is a dropdown of indicators.</w:t>
       </w:r>
     </w:p>
     <w:p>
@@ -1698,47 +2355,13 @@
           <w:bCs/>
           <w:b/>
         </w:rPr>
-        <w:t xml:space="preserve">Charts:</w:t>
-      </w:r>
-      <w:r>
-        <w:t xml:space="preserve"> </w:t>
-      </w:r>
-      <w:r>
-        <w:t xml:space="preserve">one bar chart of CO₂ and four time-series charts; the title of each is a dropdown of indicators.</w:t>
-      </w:r>
-    </w:p>
-    <w:p>
-      <w:pPr>
-        <w:pStyle w:val="FirstParagraph"/>
-      </w:pPr>
-      <w:r>
-        <w:rPr>
-          <w:bCs/>
-          <w:b/>
-        </w:rPr>
-        <w:t xml:space="preserve">MTOutputs</w:t>
-      </w:r>
-      <w:r>
-        <w:t xml:space="preserve"> </w:t>
-      </w:r>
-      <w:r>
-        <w:t xml:space="preserve">lists the key indicators of each live scenario by output code;</w:t>
-      </w:r>
-      <w:r>
-        <w:t xml:space="preserve"> </w:t>
-      </w:r>
-      <w:r>
-        <w:rPr>
-          <w:bCs/>
-          <w:b/>
-        </w:rPr>
-        <w:t xml:space="preserve">StoredOutputs</w:t>
-      </w:r>
-      <w:r>
-        <w:t xml:space="preserve"> </w:t>
-      </w:r>
-      <w:r>
-        <w:t xml:space="preserve">keeps the stored scenarios as values. Every row carries a code (for example</w:t>
+        <w:t xml:space="preserve">Stored results</w:t>
+      </w:r>
+      <w:r>
+        <w:t xml:space="preserve"> </w:t>
+      </w:r>
+      <w:r>
+        <w:t xml:space="preserve">are in the Master:</w:t>
       </w:r>
       <w:r>
         <w:t xml:space="preserve"> </w:t>
@@ -1747,14 +2370,32 @@
         <w:rPr>
           <w:rStyle w:val="VerbatimChar"/>
         </w:rPr>
-        <w:t xml:space="preserve">egy.mit.co2.tot.tot.2</w:t>
-      </w:r>
-      <w:r>
-        <w:t xml:space="preserve">: country, module, variable, sector, fuel, scenario), the same codes as the Python model.</w:t>
-      </w:r>
-    </w:p>
-    <w:bookmarkEnd w:id="32"/>
-    <w:bookmarkStart w:id="33" w:name="limits-and-differences-from-legacy"/>
+        <w:t xml:space="preserve">StoredScenarios</w:t>
+      </w:r>
+      <w:r>
+        <w:t xml:space="preserve"> </w:t>
+      </w:r>
+      <w:r>
+        <w:t xml:space="preserve">(values, MTOutputs’ rows, ten slots) and</w:t>
+      </w:r>
+      <w:r>
+        <w:t xml:space="preserve"> </w:t>
+      </w:r>
+      <w:r>
+        <w:rPr>
+          <w:rStyle w:val="VerbatimChar"/>
+        </w:rPr>
+        <w:t xml:space="preserve">CompareStored</w:t>
+      </w:r>
+      <w:r>
+        <w:t xml:space="preserve"> </w:t>
+      </w:r>
+      <w:r>
+        <w:t xml:space="preserve">(the stored scenarios against the baseline, for a chosen year).</w:t>
+      </w:r>
+    </w:p>
+    <w:bookmarkEnd w:id="33"/>
+    <w:bookmarkStart w:id="34" w:name="limits-and-differences-from-legacy"/>
     <w:p>
       <w:pPr>
         <w:pStyle w:val="Heading1"/>
@@ -1976,8 +2617,8 @@
         <w:t xml:space="preserve">the shipped data are Egypt’s; proprietary tables for other countries must be pasted in or linked (issue I90).</w:t>
       </w:r>
     </w:p>
-    <w:bookmarkEnd w:id="33"/>
-    <w:bookmarkStart w:id="34" w:name="appendix-a.-the-register-bugs-and-issues"/>
+    <w:bookmarkEnd w:id="34"/>
+    <w:bookmarkStart w:id="35" w:name="appendix-a.-the-register-bugs-and-issues"/>
     <w:p>
       <w:pPr>
         <w:pStyle w:val="Heading1"/>
@@ -2000,7 +2641,7 @@
         <w:rPr>
           <w:rStyle w:val="VerbatimChar"/>
         </w:rPr>
-        <w:t xml:space="preserve">excel_ai/bugs_and_legacy/Tracking_Legacy_Bugs_v1.1.0.xlsx</w:t>
+        <w:t xml:space="preserve">excel_ai/bugs_and_legacy/Tracking_Legacy_Bugs_v1.2.0.xlsx</w:t>
       </w:r>
       <w:r>
         <w:t xml:space="preserve"> </w:t>
@@ -2015,7 +2656,7 @@
         <w:rPr>
           <w:rStyle w:val="VerbatimChar"/>
         </w:rPr>
-        <w:t xml:space="preserve">excel_ai/bugs_and_legacy/Legacy_CPAT_Bugs_v1.1.0.docx</w:t>
+        <w:t xml:space="preserve">excel_ai/bugs_and_legacy/Legacy_CPAT_Bugs_v1.2.0.docx</w:t>
       </w:r>
       <w:r>
         <w:t xml:space="preserve">, the rest in these appendices. Codes renumbered in v0.8.4 give their former code.</w:t>
@@ -2281,7 +2922,7 @@
               <w:jc w:val="left"/>
             </w:pPr>
             <w:r>
-              <w:t xml:space="preserve">Register; methodology documentation (docs/01_MainDocumentation)</w:t>
+              <w:t xml:space="preserve">Register; methodology documentation (docs/CPAT_full_documentation_qmd)</w:t>
             </w:r>
           </w:p>
         </w:tc>
@@ -2491,8 +3132,8 @@
         </w:tc>
       </w:tr>
     </w:tbl>
-    <w:bookmarkEnd w:id="34"/>
-    <w:bookmarkStart w:id="35" w:name="appendix-b.-data-problems"/>
+    <w:bookmarkEnd w:id="35"/>
+    <w:bookmarkStart w:id="36" w:name="appendix-b.-data-problems"/>
     <w:p>
       <w:pPr>
         <w:pStyle w:val="Heading1"/>
@@ -3542,8 +4183,8 @@
         <w:t xml:space="preserve">Open.</w:t>
       </w:r>
     </w:p>
-    <w:bookmarkEnd w:id="35"/>
-    <w:bookmarkStart w:id="36" w:name="appendix-c.-issues-i"/>
+    <w:bookmarkEnd w:id="36"/>
+    <w:bookmarkStart w:id="37" w:name="appendix-c.-issues-i"/>
     <w:p>
       <w:pPr>
         <w:pStyle w:val="Heading1"/>
@@ -11971,8 +12612,8 @@
         <w:t xml:space="preserve">Open.</w:t>
       </w:r>
     </w:p>
-    <w:bookmarkEnd w:id="36"/>
-    <w:bookmarkStart w:id="37" w:name="X3175de83433cae6ead4882f8125f4fef16e060c"/>
+    <w:bookmarkEnd w:id="37"/>
+    <w:bookmarkStart w:id="38" w:name="X3175de83433cae6ead4882f8125f4fef16e060c"/>
     <w:p>
       <w:pPr>
         <w:pStyle w:val="Heading1"/>
@@ -13422,7 +14063,7 @@
               <w:jc w:val="left"/>
             </w:pPr>
             <w:r>
-              <w:t xml:space="preserve">Legacy: Dashboard rows 61-98 and 540-559 (outside MTInputs). Prototype: Policies: MTInputs rows 416-477 after the template (scenario-specific, legacy Dashboard defaults, all off); parameters and hardcoded literals (Gompertz constant, gas liters per GJ, PHEV kWh per liter, insurance factor, BEV distance caps, price elasticities): sheets TransportParams, TransportPaths and named constants.</w:t>
+              <w:t xml:space="preserve">Legacy: Dashboard rows 61-98 and 540-559 (outside MTInputs). Prototype: Policies: MTInputs rows after the template (New policies and Treatment of existing policies; scenario-specific, legacy Dashboard defaults, all off); parameters and hardcoded literals (Gompertz constant, gas liters per GJ, PHEV kWh per liter, insurance factor, BEV distance caps, price elasticities): sheets TransportParams, TransportPaths and named constants.</w:t>
             </w:r>
           </w:p>
         </w:tc>
@@ -14318,8 +14959,8 @@
         </w:tc>
       </w:tr>
     </w:tbl>
-    <w:bookmarkEnd w:id="37"/>
-    <w:bookmarkStart w:id="38" w:name="appendix-e.-upgrades-u"/>
+    <w:bookmarkEnd w:id="38"/>
+    <w:bookmarkStart w:id="39" w:name="appendix-e.-upgrades-u"/>
     <w:p>
       <w:pPr>
         <w:pStyle w:val="Heading1"/>
@@ -15107,8 +15748,8 @@
         </w:tc>
       </w:tr>
     </w:tbl>
-    <w:bookmarkEnd w:id="38"/>
-    <w:bookmarkStart w:id="39" w:name="appendix-f.-prototype-bugs-m"/>
+    <w:bookmarkEnd w:id="39"/>
+    <w:bookmarkStart w:id="40" w:name="appendix-f.-prototype-bugs-m"/>
     <w:p>
       <w:pPr>
         <w:pStyle w:val="Heading1"/>
@@ -16686,8 +17327,8 @@
         </w:tc>
       </w:tr>
     </w:tbl>
-    <w:bookmarkEnd w:id="39"/>
-    <w:bookmarkStart w:id="48" w:name="Xa4abf58d0ae67087a7628a4041fa7691755b613"/>
+    <w:bookmarkEnd w:id="40"/>
+    <w:bookmarkStart w:id="49" w:name="Xa4abf58d0ae67087a7628a4041fa7691755b613"/>
     <w:p>
       <w:pPr>
         <w:pStyle w:val="Heading1"/>
@@ -16696,7 +17337,7 @@
         <w:t xml:space="preserve">Appendix G. The bug-fixing procedure for legacy CPAT</w:t>
       </w:r>
     </w:p>
-    <w:bookmarkStart w:id="40" w:name="Xa28046c36a4d403bb6c8eaa0ce45177562bf6ba"/>
+    <w:bookmarkStart w:id="41" w:name="Xa28046c36a4d403bb6c8eaa0ce45177562bf6ba"/>
     <w:p>
       <w:pPr>
         <w:pStyle w:val="Heading2"/>
@@ -16843,8 +17484,8 @@
         </w:tc>
       </w:tr>
     </w:tbl>
-    <w:bookmarkEnd w:id="40"/>
-    <w:bookmarkStart w:id="41" w:name="g.2-before-you-start"/>
+    <w:bookmarkEnd w:id="41"/>
+    <w:bookmarkStart w:id="42" w:name="g.2-before-you-start"/>
     <w:p>
       <w:pPr>
         <w:pStyle w:val="Heading2"/>
@@ -16913,8 +17554,8 @@
         <w:t xml:space="preserve">A fix in the baseline block is pasted into the policy block (G.1); rows above 2173 are shared and have no policy copy.</w:t>
       </w:r>
     </w:p>
-    <w:bookmarkEnd w:id="41"/>
-    <w:bookmarkStart w:id="42" w:name="g.3-stages-of-a-fix"/>
+    <w:bookmarkEnd w:id="42"/>
+    <w:bookmarkStart w:id="43" w:name="g.3-stages-of-a-fix"/>
     <w:p>
       <w:pPr>
         <w:pStyle w:val="Heading2"/>
@@ -17395,8 +18036,8 @@
         </w:tc>
       </w:tr>
     </w:tbl>
-    <w:bookmarkEnd w:id="42"/>
-    <w:bookmarkStart w:id="43" w:name="g.4-applying-a-cell-level-plan"/>
+    <w:bookmarkEnd w:id="43"/>
+    <w:bookmarkStart w:id="44" w:name="g.4-applying-a-cell-level-plan"/>
     <w:p>
       <w:pPr>
         <w:pStyle w:val="Heading2"/>
@@ -17428,7 +18069,7 @@
         <w:t xml:space="preserve"> </w:t>
       </w:r>
       <w:r>
-        <w:t xml:space="preserve">column says which) the repository holds a cell-level plan (excel_ai/bugs_and_legacy/fixes/data, JSON): for each cell the formula now, the new formula, the range to fill and the policy row. Apply a plan as stage F above: type the new formula in the cell, fill the range, copy the baseline cells onto the policy row given (Paste Special, Formulas), recalculate, then run T1-T7. The plans are printed with each bug in Legacy_CPAT_Bugs_v1.1.0.docx.</w:t>
+        <w:t xml:space="preserve">column says which) the repository holds a cell-level plan (excel_ai/bugs_and_legacy/fixes/data, JSON): for each cell the formula now, the new formula, the range to fill and the policy row. Apply a plan as stage F above: type the new formula in the cell, fill the range, copy the baseline cells onto the policy row given (Paste Special, Formulas), recalculate, then run T1-T7. The plans are printed with each bug in Legacy_CPAT_Bugs_v1.2.0.docx.</w:t>
       </w:r>
     </w:p>
     <w:p>
@@ -17439,8 +18080,8 @@
         <w:t xml:space="preserve">For bugs without a cell plan yet the bug entry gives the legacy rows, what legacy does and the fix it needs. Write the plan as the existing ones were made (excel_ai/bugs_and_legacy/fixes/tools: build the new formula by exact text substitution of the legacy formula, stop if the legacy text is not found, check the brackets), add it to the JSON and regenerate this document.</w:t>
       </w:r>
     </w:p>
-    <w:bookmarkEnd w:id="43"/>
-    <w:bookmarkStart w:id="44" w:name="g.5-worked-example-bug-l1"/>
+    <w:bookmarkEnd w:id="44"/>
+    <w:bookmarkStart w:id="45" w:name="g.5-worked-example-bug-l1"/>
     <w:p>
       <w:pPr>
         <w:pStyle w:val="Heading2"/>
@@ -17731,8 +18372,8 @@
         </w:tc>
       </w:tr>
     </w:tbl>
-    <w:bookmarkEnd w:id="44"/>
-    <w:bookmarkStart w:id="45" w:name="g.6-reusing-the-harness-for-the-next-bug"/>
+    <w:bookmarkEnd w:id="45"/>
+    <w:bookmarkStart w:id="46" w:name="g.6-reusing-the-harness-for-the-next-bug"/>
     <w:p>
       <w:pPr>
         <w:pStyle w:val="Heading2"/>
@@ -17965,8 +18606,8 @@
         <w:t xml:space="preserve">.</w:t>
       </w:r>
     </w:p>
-    <w:bookmarkEnd w:id="45"/>
-    <w:bookmarkStart w:id="46" w:name="g.7-after-the-fix"/>
+    <w:bookmarkEnd w:id="46"/>
+    <w:bookmarkStart w:id="47" w:name="g.7-after-the-fix"/>
     <w:p>
       <w:pPr>
         <w:pStyle w:val="Heading2"/>
@@ -18026,8 +18667,8 @@
         <w:t xml:space="preserve">Run a policy scenario as well as the baseline (switch MTInputs D6, _ScenarioToRun): T1-T4 must still pass.</w:t>
       </w:r>
     </w:p>
-    <w:bookmarkEnd w:id="46"/>
-    <w:bookmarkStart w:id="47" w:name="g.8-limits"/>
+    <w:bookmarkEnd w:id="47"/>
+    <w:bookmarkStart w:id="48" w:name="g.8-limits"/>
     <w:p>
       <w:pPr>
         <w:pStyle w:val="Heading2"/>
@@ -18084,8 +18725,8 @@
         <w:t xml:space="preserve">Needs macros enabled and the file kept as .xlsb or .xlsm.</w:t>
       </w:r>
     </w:p>
-    <w:bookmarkEnd w:id="47"/>
     <w:bookmarkEnd w:id="48"/>
+    <w:bookmarkEnd w:id="49"/>
     <w:sectPr/>
   </w:body>
 </w:document>

</xml_diff>